<commit_message>
Fix localized reports and UI request routing
</commit_message>
<xml_diff>
--- a/api/src/backend/api/v1/report_templates/zh-CN/executive_report/executive_report-template.docx
+++ b/api/src/backend/api/v1/report_templates/zh-CN/executive_report/executive_report-template.docx
@@ -296,7 +296,7 @@
           <w:sz w:val="20"/>
           <w:szCs w:val="20"/>
         </w:rPr>
-        <w:t>1.3 关键发现</w:t>
+        <w:t>1.3 关键检测结果</w:t>
         <w:tab/>
         <w:t>4</w:t>
       </w:r>
@@ -418,7 +418,7 @@
           <w:sz w:val="24"/>
           <w:szCs w:val="24"/>
         </w:rPr>
-        <w:t>3. 发现概览</w:t>
+        <w:t>3. 检测结果概览</w:t>
         <w:tab/>
         <w:t>9</w:t>
       </w:r>
@@ -442,7 +442,7 @@
           <w:sz w:val="20"/>
           <w:szCs w:val="20"/>
         </w:rPr>
-        <w:t>3.1 按服务统计发现</w:t>
+        <w:t>3.1 按服务统计检测结果</w:t>
         <w:tab/>
         <w:t>9</w:t>
       </w:r>
@@ -466,7 +466,7 @@
           <w:sz w:val="20"/>
           <w:szCs w:val="20"/>
         </w:rPr>
-        <w:t>3.2 按类别统计发现</w:t>
+        <w:t>3.2 按类别统计检测结果</w:t>
         <w:tab/>
         <w:t>10</w:t>
       </w:r>
@@ -1211,7 +1211,7 @@
           <w:sz w:val="21"/>
           <w:szCs w:val="21"/>
         </w:rPr>
-        <w:t>表 1-2 发现汇总</w:t>
+        <w:t>表 1-2 检测结果汇总</w:t>
       </w:r>
     </w:p>
     <w:tbl>
@@ -1768,7 +1768,7 @@
           <w:sz w:val="28"/>
           <w:szCs w:val="28"/>
         </w:rPr>
-        <w:t>1.3 关键发现</w:t>
+        <w:t>1.3 关键检测结果</w:t>
       </w:r>
     </w:p>
     <w:p>
@@ -1808,7 +1808,7 @@
           <w:sz w:val="21"/>
           <w:szCs w:val="21"/>
         </w:rPr>
-        <w:t>表 1-3 严重发现</w:t>
+        <w:t>表 1-3 严重检测结果</w:t>
       </w:r>
     </w:p>
     <w:tbl>
@@ -1869,7 +1869,7 @@
                 <w:sz w:val="21"/>
                 <w:szCs w:val="21"/>
               </w:rPr>
-              <w:t>发现</w:t>
+              <w:t>检测结果</w:t>
             </w:r>
           </w:p>
         </w:tc>
@@ -2065,7 +2065,7 @@
           <w:sz w:val="21"/>
           <w:szCs w:val="21"/>
         </w:rPr>
-        <w:t>表 1-4 高危发现</w:t>
+        <w:t>表 1-4 高危检测结果</w:t>
       </w:r>
     </w:p>
     <w:tbl>
@@ -2126,7 +2126,7 @@
                 <w:sz w:val="21"/>
                 <w:szCs w:val="21"/>
               </w:rPr>
-              <w:t>发现</w:t>
+              <w:t>检测结果</w:t>
             </w:r>
           </w:p>
         </w:tc>
@@ -2533,7 +2533,7 @@
                 <w:sz w:val="21"/>
                 <w:szCs w:val="21"/>
               </w:rPr>
-              <w:t>发现数</w:t>
+              <w:t>检测结果数</w:t>
             </w:r>
           </w:p>
         </w:tc>
@@ -3879,7 +3879,7 @@
           <w:sz w:val="36"/>
           <w:szCs w:val="36"/>
         </w:rPr>
-        <w:t>3. 发现概览</w:t>
+        <w:t>3. 检测结果概览</w:t>
       </w:r>
     </w:p>
     <w:p>
@@ -3898,7 +3898,7 @@
           <w:sz w:val="28"/>
           <w:szCs w:val="28"/>
         </w:rPr>
-        <w:t>3.1 按服务统计发现</w:t>
+        <w:t>3.1 按服务统计检测结果</w:t>
       </w:r>
     </w:p>
     <w:p>
@@ -3919,7 +3919,7 @@
           <w:sz w:val="21"/>
           <w:szCs w:val="21"/>
         </w:rPr>
-        <w:t>表 3-1 按服务统计发现</w:t>
+        <w:t>表 3-1 按服务统计检测结果</w:t>
       </w:r>
     </w:p>
     <w:tbl>
@@ -4479,7 +4479,7 @@
           <w:sz w:val="21"/>
           <w:szCs w:val="21"/>
         </w:rPr>
-        <w:t>图 3-1 按服务统计发现</w:t>
+        <w:t>图 3-1 按服务统计检测结果</w:t>
       </w:r>
     </w:p>
     <w:p>
@@ -4529,7 +4529,7 @@
           <w:sz w:val="28"/>
           <w:szCs w:val="28"/>
         </w:rPr>
-        <w:t>3.2 按类别统计发现</w:t>
+        <w:t>3.2 按类别统计检测结果</w:t>
       </w:r>
     </w:p>
     <w:p>
@@ -4550,7 +4550,7 @@
           <w:sz w:val="21"/>
           <w:szCs w:val="21"/>
         </w:rPr>
-        <w:t>表 3-2 按类别统计发现</w:t>
+        <w:t>表 3-2 按类别统计检测结果</w:t>
       </w:r>
     </w:p>
     <w:tbl>
@@ -4645,7 +4645,7 @@
                 <w:sz w:val="21"/>
                 <w:szCs w:val="21"/>
               </w:rPr>
-              <w:t>发现数</w:t>
+              <w:t>检测结果数</w:t>
             </w:r>
           </w:p>
         </w:tc>
@@ -4803,7 +4803,7 @@
           <w:sz w:val="21"/>
           <w:szCs w:val="21"/>
         </w:rPr>
-        <w:t>图 3-2 按类别统计发现</w:t>
+        <w:t>图 3-2 按类别统计检测结果</w:t>
       </w:r>
     </w:p>
     <w:p>
@@ -4900,7 +4900,7 @@
           <w:sz w:val="21"/>
           <w:szCs w:val="21"/>
         </w:rPr>
-        <w:t>表 4-1 优先级 1 发现</w:t>
+        <w:t>表 4-1 优先级 1 检测结果</w:t>
       </w:r>
     </w:p>
     <w:tbl>
@@ -4961,7 +4961,7 @@
                 <w:sz w:val="21"/>
                 <w:szCs w:val="21"/>
               </w:rPr>
-              <w:t>发现</w:t>
+              <w:t>检测结果</w:t>
             </w:r>
           </w:p>
         </w:tc>
@@ -5277,7 +5277,7 @@
           <w:sz w:val="21"/>
           <w:szCs w:val="21"/>
         </w:rPr>
-        <w:t>表 4-2 优先级 2 发现</w:t>
+        <w:t>表 4-2 优先级 2 检测结果</w:t>
       </w:r>
     </w:p>
     <w:tbl>
@@ -5338,7 +5338,7 @@
                 <w:sz w:val="21"/>
                 <w:szCs w:val="21"/>
               </w:rPr>
-              <w:t>发现</w:t>
+              <w:t>检测结果</w:t>
             </w:r>
           </w:p>
         </w:tc>
@@ -5544,7 +5544,7 @@
           <w:sz w:val="21"/>
           <w:szCs w:val="21"/>
         </w:rPr>
-        <w:t>表 4-3 优先级 3 发现</w:t>
+        <w:t>表 4-3 优先级 3 检测结果</w:t>
       </w:r>
     </w:p>
     <w:tbl>
@@ -5605,7 +5605,7 @@
                 <w:sz w:val="21"/>
                 <w:szCs w:val="21"/>
               </w:rPr>
-              <w:t>发现</w:t>
+              <w:t>检测结果</w:t>
             </w:r>
           </w:p>
         </w:tc>
@@ -6060,7 +6060,7 @@
           <w:sz w:val="21"/>
           <w:szCs w:val="21"/>
         </w:rPr>
-        <w:t>将云安全发现接入事件响应流程。</w:t>
+        <w:t>将云安全检测结果接入事件响应流程。</w:t>
       </w:r>
     </w:p>
     <w:p>

</xml_diff>